<commit_message>
Add change password feature for general staff
</commit_message>
<xml_diff>
--- a/รูปแบบการ push.docx
+++ b/รูปแบบการ push.docx
@@ -6,6 +6,7 @@
       <w:r>
         <w:rPr>
           <w:rFonts w:cs="Cordia New"/>
+          <w:noProof/>
           <w:cs/>
         </w:rPr>
         <w:drawing>
@@ -49,6 +50,9 @@
     <w:p/>
     <w:p>
       <w:r>
+        <w:rPr>
+          <w:noProof/>
+        </w:rPr>
         <w:drawing>
           <wp:inline distT="0" distB="0" distL="0" distR="0" wp14:anchorId="1DCA1040" wp14:editId="5E4C28D3">
             <wp:extent cx="5943600" cy="2589530"/>
@@ -88,15 +92,10 @@
     </w:p>
     <w:p/>
     <w:p>
-      <w:pPr>
-        <w:rPr>
-          <w:rFonts w:hint="cs"/>
-          <w:cs/>
-        </w:rPr>
-      </w:pPr>
       <w:r>
         <w:rPr>
           <w:rFonts w:cs="Cordia New"/>
+          <w:noProof/>
           <w:cs/>
         </w:rPr>
         <w:lastRenderedPageBreak/>
@@ -135,6 +134,74 @@
             </a:graphic>
           </wp:inline>
         </w:drawing>
+      </w:r>
+    </w:p>
+    <w:p>
+      <w:r>
+        <w:rPr>
+          <w:rFonts w:cs="Cordia New"/>
+          <w:cs/>
+        </w:rPr>
+        <w:drawing>
+          <wp:inline distT="0" distB="0" distL="0" distR="0" wp14:anchorId="525AA649" wp14:editId="1989D495">
+            <wp:extent cx="5943600" cy="4039870"/>
+            <wp:effectExtent l="0" t="0" r="0" b="0"/>
+            <wp:docPr id="279882901" name="รูปภาพ 1" descr="รูปภาพประกอบด้วย ข้อความ, ภาพหน้าจอ, ตัวอักษร&#10;&#10;เนื้อหาที่สร้างโดย AI อาจไม่ถูกต้อง"/>
+            <wp:cNvGraphicFramePr>
+              <a:graphicFrameLocks xmlns:a="http://schemas.openxmlformats.org/drawingml/2006/main" noChangeAspect="1"/>
+            </wp:cNvGraphicFramePr>
+            <a:graphic xmlns:a="http://schemas.openxmlformats.org/drawingml/2006/main">
+              <a:graphicData uri="http://schemas.openxmlformats.org/drawingml/2006/picture">
+                <pic:pic xmlns:pic="http://schemas.openxmlformats.org/drawingml/2006/picture">
+                  <pic:nvPicPr>
+                    <pic:cNvPr id="279882901" name="รูปภาพ 1" descr="รูปภาพประกอบด้วย ข้อความ, ภาพหน้าจอ, ตัวอักษร&#10;&#10;เนื้อหาที่สร้างโดย AI อาจไม่ถูกต้อง"/>
+                    <pic:cNvPicPr/>
+                  </pic:nvPicPr>
+                  <pic:blipFill>
+                    <a:blip r:embed="rId7"/>
+                    <a:stretch>
+                      <a:fillRect/>
+                    </a:stretch>
+                  </pic:blipFill>
+                  <pic:spPr>
+                    <a:xfrm>
+                      <a:off x="0" y="0"/>
+                      <a:ext cx="5943600" cy="4039870"/>
+                    </a:xfrm>
+                    <a:prstGeom prst="rect">
+                      <a:avLst/>
+                    </a:prstGeom>
+                  </pic:spPr>
+                </pic:pic>
+              </a:graphicData>
+            </a:graphic>
+          </wp:inline>
+        </w:drawing>
+      </w:r>
+    </w:p>
+    <w:p>
+      <w:pPr>
+        <w:rPr>
+          <w:rFonts w:hint="cs"/>
+          <w:cs/>
+        </w:rPr>
+      </w:pPr>
+      <w:r>
+        <w:rPr>
+          <w:rFonts w:hint="cs"/>
+          <w:cs/>
+        </w:rPr>
+        <w:t xml:space="preserve">คำสั่งคืนไฟล์ </w:t>
+      </w:r>
+      <w:r>
+        <w:t xml:space="preserve">push </w:t>
+      </w:r>
+      <w:r>
+        <w:rPr>
+          <w:rFonts w:hint="cs"/>
+          <w:cs/>
+        </w:rPr>
+        <w:t>ล่าสุด</w:t>
       </w:r>
     </w:p>
     <w:sectPr>

</xml_diff>

<commit_message>
Update login pages with modern UI design and animations
</commit_message>
<xml_diff>
--- a/รูปแบบการ push.docx
+++ b/รูปแบบการ push.docx
@@ -136,12 +136,107 @@
         </w:drawing>
       </w:r>
     </w:p>
+    <w:p/>
+    <w:p>
+      <w:r>
+        <w:t>npm run build</w:t>
+      </w:r>
+    </w:p>
+    <w:p>
+      <w:r>
+        <w:t>Remove-Item -Recurse -Force static</w:t>
+      </w:r>
+    </w:p>
+    <w:p>
+      <w:r>
+        <w:t>Copy-Item build\index.html index.html</w:t>
+      </w:r>
+    </w:p>
+    <w:p>
+      <w:r>
+        <w:t>Copy-Item -Recurse build\static static</w:t>
+      </w:r>
+    </w:p>
+    <w:p>
+      <w:r>
+        <w:t xml:space="preserve">Copy-Item build\manifest.json </w:t>
+      </w:r>
+      <w:proofErr w:type="gramStart"/>
+      <w:r>
+        <w:t>manifest.json</w:t>
+      </w:r>
+      <w:proofErr w:type="gramEnd"/>
+    </w:p>
+    <w:p>
+      <w:r>
+        <w:t xml:space="preserve">git </w:t>
+      </w:r>
+      <w:proofErr w:type="gramStart"/>
+      <w:r>
+        <w:t>add .</w:t>
+      </w:r>
+      <w:proofErr w:type="gramEnd"/>
+    </w:p>
+    <w:p>
+      <w:r>
+        <w:t>git commit -m "</w:t>
+      </w:r>
+      <w:r>
+        <w:rPr>
+          <w:rFonts w:hint="cs"/>
+          <w:cs/>
+        </w:rPr>
+        <w:t xml:space="preserve"> ตรง นี้จะใส่ชื่อของการ </w:t>
+      </w:r>
+      <w:r>
+        <w:t xml:space="preserve">push </w:t>
+      </w:r>
+      <w:r>
+        <w:rPr>
+          <w:rFonts w:hint="cs"/>
+          <w:cs/>
+        </w:rPr>
+        <w:t>นั้นๆ</w:t>
+      </w:r>
+      <w:r>
+        <w:t>"</w:t>
+      </w:r>
+    </w:p>
+    <w:p>
+      <w:r>
+        <w:t>git push origin main</w:t>
+      </w:r>
+    </w:p>
+    <w:p>
+      <w:pPr>
+        <w:rPr>
+          <w:rFonts w:hint="cs"/>
+        </w:rPr>
+      </w:pPr>
+    </w:p>
+    <w:p>
+      <w:pPr>
+        <w:rPr>
+          <w:rFonts w:hint="cs"/>
+        </w:rPr>
+      </w:pPr>
+    </w:p>
+    <w:p/>
+    <w:p/>
+    <w:p>
+      <w:pPr>
+        <w:rPr>
+          <w:rFonts w:hint="cs"/>
+        </w:rPr>
+      </w:pPr>
+    </w:p>
     <w:p>
       <w:r>
         <w:rPr>
           <w:rFonts w:cs="Cordia New"/>
           <w:cs/>
         </w:rPr>
+        <w:lastRenderedPageBreak/>
         <w:drawing>
           <wp:inline distT="0" distB="0" distL="0" distR="0" wp14:anchorId="525AA649" wp14:editId="1989D495">
             <wp:extent cx="5943600" cy="4039870"/>
@@ -817,7 +912,6 @@
   <w:style w:type="character" w:default="1" w:styleId="a0">
     <w:name w:val="Default Paragraph Font"/>
     <w:uiPriority w:val="1"/>
-    <w:semiHidden/>
     <w:unhideWhenUsed/>
   </w:style>
   <w:style w:type="table" w:default="1" w:styleId="a1">

</xml_diff>